<commit_message>
🏛️ Resume Update: Update Name to 'PRAVALLIKA RAMACHANDRAPURAPU' and Title to 'Assistant Manager' [obsiagent-boop]
</commit_message>
<xml_diff>
--- a/docs/Pravallika_Resume_Standard_Template.docx
+++ b/docs/Pravallika_Resume_Standard_Template.docx
@@ -10,9 +10,22 @@
       <w:r>
         <w:rPr>
           <w:b/>
-          <w:sz w:val="36"/>
+          <w:sz w:val="32"/>
         </w:rPr>
-        <w:t>PRAVALLIKA</w:t>
+        <w:t>PRAVALLIKA RAMACHANDRAPURAPU</w:t>
+      </w:r>
+    </w:p>
+    <w:p>
+      <w:pPr>
+        <w:spacing w:before="0" w:after="40"/>
+        <w:jc w:val="center"/>
+      </w:pPr>
+      <w:r>
+        <w:rPr>
+          <w:b/>
+          <w:sz w:val="21"/>
+        </w:rPr>
+        <w:t>Customer Support Senior Team Lead | Assistant Manager</w:t>
       </w:r>
     </w:p>
     <w:p>
@@ -22,20 +35,7 @@
       </w:pPr>
       <w:r>
         <w:rPr>
-          <w:b/>
-          <w:sz w:val="21"/>
-        </w:rPr>
-        <w:t>Customer Support Senior Team Lead | Operations &amp; CX Delivery Lead</w:t>
-      </w:r>
-    </w:p>
-    <w:p>
-      <w:pPr>
-        <w:spacing w:before="0" w:after="80"/>
-        <w:jc w:val="center"/>
-      </w:pPr>
-      <w:r>
-        <w:rPr>
-          <w:sz w:val="18"/>
+          <w:sz w:val="17"/>
         </w:rPr>
         <w:t>Hyderabad, India  •  LinkedIn: linkedin.com/in/pravallika  •  Email: Contact Available on Request</w:t>
       </w:r>
@@ -43,7 +43,7 @@
     <w:p>
       <w:pPr>
         <w:keepNext/>
-        <w:spacing w:before="120" w:after="40"/>
+        <w:spacing w:before="100" w:after="40"/>
         <w:pBdr>
           <w:bottom w:val="single" w:sz="12" w:space="1" w:color="000000"/>
         </w:pBdr>
@@ -52,23 +52,23 @@
         <w:rPr>
           <w:b/>
           <w:color w:val="000000"/>
-          <w:sz w:val="22"/>
+          <w:sz w:val="21"/>
         </w:rPr>
         <w:t>PROFESSIONAL SUMMARY</w:t>
       </w:r>
     </w:p>
     <w:p>
       <w:pPr>
-        <w:spacing w:before="20" w:after="80" w:line="264" w:lineRule="auto"/>
+        <w:spacing w:before="20" w:after="60" w:line="259" w:lineRule="auto"/>
       </w:pPr>
       <w:r>
-        <w:t>Customer Support Senior Team Lead with 6+ years leading high-volume, cross-office teams (Amazon, Uber AI, Google via Randstad) for Business and Consumer customers. Expert in delegating operational work, driving KPI-based process improvement, and representing teams in audits while sustaining 99-100% quality and service accuracy. Re-evaluates KPIs against real-time operational results, partners with Training coordinators on associate upskilling, and delivers CX outcomes via Agile/Scrum and Root Cause Analysis (RCA).</w:t>
+        <w:t>Customer Support Senior Team Lead &amp; Assistant Manager with 6+ years leading high-volume, cross-office teams (Amazon, Uber AI, Google via Randstad) for Business and Consumer customers. Expert in delegating operational work, driving KPI-based process improvement, and representing teams in audits while sustaining 99-100% quality and service accuracy. Re-evaluates KPIs against real-time operational results, partners with Training coordinators on associate upskilling, and delivers CX outcomes via Agile/Scrum and Root Cause Analysis (RCA).</w:t>
       </w:r>
     </w:p>
     <w:p>
       <w:pPr>
         <w:keepNext/>
-        <w:spacing w:before="120" w:after="40"/>
+        <w:spacing w:before="100" w:after="40"/>
         <w:pBdr>
           <w:bottom w:val="single" w:sz="12" w:space="1" w:color="000000"/>
         </w:pBdr>
@@ -77,7 +77,7 @@
         <w:rPr>
           <w:b/>
           <w:color w:val="000000"/>
-          <w:sz w:val="22"/>
+          <w:sz w:val="21"/>
         </w:rPr>
         <w:t>EDUCATION</w:t>
       </w:r>
@@ -89,8 +89,8 @@
         <w:tblLook w:firstColumn="1" w:firstRow="1" w:lastColumn="0" w:lastRow="0" w:noHBand="0" w:noVBand="1" w:val="04A0"/>
       </w:tblPr>
       <w:tblGrid>
-        <w:gridCol w:w="7200"/>
-        <w:gridCol w:w="3600"/>
+        <w:gridCol w:w="7488"/>
+        <w:gridCol w:w="3312"/>
       </w:tblGrid>
       <w:tr>
         <w:tc>
@@ -105,12 +105,12 @@
           </w:tcPr>
           <w:p>
             <w:pPr>
-              <w:spacing w:before="40" w:after="20"/>
+              <w:spacing w:before="40" w:after="0"/>
             </w:pPr>
             <w:r>
               <w:rPr>
                 <w:b/>
-                <w:sz w:val="20"/>
+                <w:sz w:val="19"/>
               </w:rPr>
               <w:t>Kent State University</w:t>
             </w:r>
@@ -120,7 +120,7 @@
             <w:r>
               <w:rPr>
                 <w:i/>
-                <w:sz w:val="19"/>
+                <w:sz w:val="18"/>
               </w:rPr>
               <w:t>Master's in Human-Computer Interaction (HCI) – Project Management (PMBOK, Agile, Scrum)</w:t>
             </w:r>
@@ -138,13 +138,13 @@
           </w:tcPr>
           <w:p>
             <w:pPr>
-              <w:spacing w:before="40" w:after="20"/>
+              <w:spacing w:before="40" w:after="0"/>
               <w:jc w:val="right"/>
             </w:pPr>
             <w:r>
               <w:rPr>
                 <w:b/>
-                <w:sz w:val="20"/>
+                <w:sz w:val="19"/>
               </w:rPr>
               <w:t>Jan 2024 – Aug 2025</w:t>
             </w:r>
@@ -153,7 +153,7 @@
             </w:r>
             <w:r>
               <w:rPr>
-                <w:sz w:val="19"/>
+                <w:sz w:val="18"/>
               </w:rPr>
               <w:t>Ohio, United States</w:t>
             </w:r>
@@ -161,24 +161,6 @@
         </w:tc>
       </w:tr>
     </w:tbl>
-    <w:p>
-      <w:pPr>
-        <w:spacing w:before="0" w:after="40"/>
-      </w:pPr>
-      <w:r>
-        <w:rPr>
-          <w:b/>
-          <w:sz w:val="18"/>
-        </w:rPr>
-        <w:t xml:space="preserve">Coursework &amp; Focus: </w:t>
-      </w:r>
-      <w:r>
-        <w:rPr>
-          <w:sz w:val="18"/>
-        </w:rPr>
-        <w:t>Project Management (Agile/Scrum, PMBOK), User Research, Interaction Design, Cross-Functional Systems.</w:t>
-      </w:r>
-    </w:p>
     <w:tbl>
       <w:tblPr>
         <w:tblW w:type="auto" w:w="0"/>
@@ -186,8 +168,8 @@
         <w:tblLook w:firstColumn="1" w:firstRow="1" w:lastColumn="0" w:lastRow="0" w:noHBand="0" w:noVBand="1" w:val="04A0"/>
       </w:tblPr>
       <w:tblGrid>
-        <w:gridCol w:w="7200"/>
-        <w:gridCol w:w="3600"/>
+        <w:gridCol w:w="7488"/>
+        <w:gridCol w:w="3312"/>
       </w:tblGrid>
       <w:tr>
         <w:tc>
@@ -202,12 +184,12 @@
           </w:tcPr>
           <w:p>
             <w:pPr>
-              <w:spacing w:before="40" w:after="20"/>
+              <w:spacing w:before="40" w:after="0"/>
             </w:pPr>
             <w:r>
               <w:rPr>
                 <w:b/>
-                <w:sz w:val="20"/>
+                <w:sz w:val="19"/>
               </w:rPr>
               <w:t>Osmania University</w:t>
             </w:r>
@@ -217,9 +199,9 @@
             <w:r>
               <w:rPr>
                 <w:i/>
-                <w:sz w:val="19"/>
+                <w:sz w:val="18"/>
               </w:rPr>
-              <w:t>Bachelor of Commerce (Honours) — Commercial Accounting &amp; Business Systems</w:t>
+              <w:t>Bachelor of Commerce (Honours) — Commercial Accounting &amp; Business Operations</w:t>
             </w:r>
           </w:p>
         </w:tc>
@@ -235,13 +217,13 @@
           </w:tcPr>
           <w:p>
             <w:pPr>
-              <w:spacing w:before="40" w:after="20"/>
+              <w:spacing w:before="40" w:after="0"/>
               <w:jc w:val="right"/>
             </w:pPr>
             <w:r>
               <w:rPr>
                 <w:b/>
-                <w:sz w:val="20"/>
+                <w:sz w:val="19"/>
               </w:rPr>
               <w:t>Completed</w:t>
             </w:r>
@@ -250,7 +232,7 @@
             </w:r>
             <w:r>
               <w:rPr>
-                <w:sz w:val="19"/>
+                <w:sz w:val="18"/>
               </w:rPr>
               <w:t>Hyderabad, India</w:t>
             </w:r>
@@ -260,26 +242,8 @@
     </w:tbl>
     <w:p>
       <w:pPr>
-        <w:spacing w:before="0" w:after="80"/>
-      </w:pPr>
-      <w:r>
-        <w:rPr>
-          <w:b/>
-          <w:sz w:val="18"/>
-        </w:rPr>
-        <w:t xml:space="preserve">Coursework &amp; Focus: </w:t>
-      </w:r>
-      <w:r>
-        <w:rPr>
-          <w:sz w:val="18"/>
-        </w:rPr>
-        <w:t>Financial Management, Business Operations, Commercial Law, Economics, Statistical Analysis.</w:t>
-      </w:r>
-    </w:p>
-    <w:p>
-      <w:pPr>
         <w:keepNext/>
-        <w:spacing w:before="120" w:after="40"/>
+        <w:spacing w:before="100" w:after="40"/>
         <w:pBdr>
           <w:bottom w:val="single" w:sz="12" w:space="1" w:color="000000"/>
         </w:pBdr>
@@ -288,14 +252,14 @@
         <w:rPr>
           <w:b/>
           <w:color w:val="000000"/>
-          <w:sz w:val="22"/>
+          <w:sz w:val="21"/>
         </w:rPr>
         <w:t>TECHNICAL SKILLS &amp; CORE COMPETENCIES</w:t>
       </w:r>
     </w:p>
     <w:p>
       <w:pPr>
-        <w:spacing w:before="20" w:after="20" w:line="252" w:lineRule="auto"/>
+        <w:spacing w:before="20" w:after="10"/>
       </w:pPr>
       <w:r>
         <w:rPr>
@@ -309,7 +273,7 @@
     </w:p>
     <w:p>
       <w:pPr>
-        <w:spacing w:before="20" w:after="20" w:line="252" w:lineRule="auto"/>
+        <w:spacing w:before="10" w:after="10"/>
       </w:pPr>
       <w:r>
         <w:rPr>
@@ -323,7 +287,7 @@
     </w:p>
     <w:p>
       <w:pPr>
-        <w:spacing w:before="20" w:after="80" w:line="252" w:lineRule="auto"/>
+        <w:spacing w:before="10" w:after="60"/>
       </w:pPr>
       <w:r>
         <w:rPr>
@@ -338,7 +302,7 @@
     <w:p>
       <w:pPr>
         <w:keepNext/>
-        <w:spacing w:before="120" w:after="40"/>
+        <w:spacing w:before="100" w:after="40"/>
         <w:pBdr>
           <w:bottom w:val="single" w:sz="12" w:space="1" w:color="000000"/>
         </w:pBdr>
@@ -347,7 +311,7 @@
         <w:rPr>
           <w:b/>
           <w:color w:val="000000"/>
-          <w:sz w:val="22"/>
+          <w:sz w:val="21"/>
         </w:rPr>
         <w:t>PROFESSIONAL EXPERIENCE</w:t>
       </w:r>
@@ -359,8 +323,8 @@
         <w:tblLook w:firstColumn="1" w:firstRow="1" w:lastColumn="0" w:lastRow="0" w:noHBand="0" w:noVBand="1" w:val="04A0"/>
       </w:tblPr>
       <w:tblGrid>
-        <w:gridCol w:w="7200"/>
-        <w:gridCol w:w="3600"/>
+        <w:gridCol w:w="7488"/>
+        <w:gridCol w:w="3312"/>
       </w:tblGrid>
       <w:tr>
         <w:tc>
@@ -375,12 +339,12 @@
           </w:tcPr>
           <w:p>
             <w:pPr>
-              <w:spacing w:before="40" w:after="20"/>
+              <w:spacing w:before="40" w:after="0"/>
             </w:pPr>
             <w:r>
               <w:rPr>
                 <w:b/>
-                <w:sz w:val="20"/>
+                <w:sz w:val="19"/>
               </w:rPr>
               <w:t>Uber AI Solutions Support (via Adecco)</w:t>
             </w:r>
@@ -390,7 +354,7 @@
             <w:r>
               <w:rPr>
                 <w:i/>
-                <w:sz w:val="19"/>
+                <w:sz w:val="18"/>
               </w:rPr>
               <w:t>Operations Lead (Ops 3)</w:t>
             </w:r>
@@ -408,13 +372,13 @@
           </w:tcPr>
           <w:p>
             <w:pPr>
-              <w:spacing w:before="40" w:after="20"/>
+              <w:spacing w:before="40" w:after="0"/>
               <w:jc w:val="right"/>
             </w:pPr>
             <w:r>
               <w:rPr>
                 <w:b/>
-                <w:sz w:val="20"/>
+                <w:sz w:val="19"/>
               </w:rPr>
               <w:t>Mar 2026 – Present</w:t>
             </w:r>
@@ -423,7 +387,7 @@
             </w:r>
             <w:r>
               <w:rPr>
-                <w:sz w:val="19"/>
+                <w:sz w:val="18"/>
               </w:rPr>
               <w:t>Hyderabad, India</w:t>
             </w:r>
@@ -434,7 +398,7 @@
     <w:p>
       <w:pPr>
         <w:pStyle w:val="ListBullet"/>
-        <w:spacing w:before="20" w:after="20" w:line="252" w:lineRule="auto"/>
+        <w:spacing w:before="10" w:after="10" w:line="252" w:lineRule="auto"/>
       </w:pPr>
       <w:r>
         <w:t>Maintained accountability and stakeholder alignment for 20 associates as primary Point of Contact (POC) for cross-team and client communications.</w:t>
@@ -443,7 +407,7 @@
     <w:p>
       <w:pPr>
         <w:pStyle w:val="ListBullet"/>
-        <w:spacing w:before="20" w:after="20" w:line="252" w:lineRule="auto"/>
+        <w:spacing w:before="10" w:after="10" w:line="252" w:lineRule="auto"/>
       </w:pPr>
       <w:r>
         <w:t>Built associate ownership through structured 1-on-1 mentorship and collaborative upskilling partnerships with Training Coordinators.</w:t>
@@ -452,7 +416,7 @@
     <w:p>
       <w:pPr>
         <w:pStyle w:val="ListBullet"/>
-        <w:spacing w:before="20" w:after="20" w:line="252" w:lineRule="auto"/>
+        <w:spacing w:before="10" w:after="10" w:line="252" w:lineRule="auto"/>
       </w:pPr>
       <w:r>
         <w:t>Ensured standard operating procedure (SOP) clarity and 100% adherence by updating process documentation and serving as the primary QA checkpoint.</w:t>
@@ -461,7 +425,7 @@
     <w:p>
       <w:pPr>
         <w:pStyle w:val="ListBullet"/>
-        <w:spacing w:before="20" w:after="20" w:line="252" w:lineRule="auto"/>
+        <w:spacing w:before="10" w:after="10" w:line="252" w:lineRule="auto"/>
       </w:pPr>
       <w:r>
         <w:t>Enhanced operational delivery and team throughput via rigorous process tracking, Root Cause Analysis (RCA), and prioritized policy-gap fixes.</w:t>
@@ -474,8 +438,8 @@
         <w:tblLook w:firstColumn="1" w:firstRow="1" w:lastColumn="0" w:lastRow="0" w:noHBand="0" w:noVBand="1" w:val="04A0"/>
       </w:tblPr>
       <w:tblGrid>
-        <w:gridCol w:w="7200"/>
-        <w:gridCol w:w="3600"/>
+        <w:gridCol w:w="7488"/>
+        <w:gridCol w:w="3312"/>
       </w:tblGrid>
       <w:tr>
         <w:tc>
@@ -490,12 +454,12 @@
           </w:tcPr>
           <w:p>
             <w:pPr>
-              <w:spacing w:before="40" w:after="20"/>
+              <w:spacing w:before="40" w:after="0"/>
             </w:pPr>
             <w:r>
               <w:rPr>
                 <w:b/>
-                <w:sz w:val="20"/>
+                <w:sz w:val="19"/>
               </w:rPr>
               <w:t>Kent State University</w:t>
             </w:r>
@@ -505,7 +469,7 @@
             <w:r>
               <w:rPr>
                 <w:i/>
-                <w:sz w:val="19"/>
+                <w:sz w:val="18"/>
               </w:rPr>
               <w:t>Graduate Professional, Academic Operations</w:t>
             </w:r>
@@ -523,13 +487,13 @@
           </w:tcPr>
           <w:p>
             <w:pPr>
-              <w:spacing w:before="40" w:after="20"/>
+              <w:spacing w:before="40" w:after="0"/>
               <w:jc w:val="right"/>
             </w:pPr>
             <w:r>
               <w:rPr>
                 <w:b/>
-                <w:sz w:val="20"/>
+                <w:sz w:val="19"/>
               </w:rPr>
               <w:t>Jan 2024 – May 2025</w:t>
             </w:r>
@@ -538,7 +502,7 @@
             </w:r>
             <w:r>
               <w:rPr>
-                <w:sz w:val="19"/>
+                <w:sz w:val="18"/>
               </w:rPr>
               <w:t>Ohio, United States</w:t>
             </w:r>
@@ -549,7 +513,7 @@
     <w:p>
       <w:pPr>
         <w:pStyle w:val="ListBullet"/>
-        <w:spacing w:before="20" w:after="20" w:line="252" w:lineRule="auto"/>
+        <w:spacing w:before="10" w:after="10" w:line="252" w:lineRule="auto"/>
       </w:pPr>
       <w:r>
         <w:t>Delivered 100% on-time project milestones for a major capstone initiative utilizing Scrum sprint coordination, risk controls, and executive stakeholder updates.</w:t>
@@ -558,7 +522,7 @@
     <w:p>
       <w:pPr>
         <w:pStyle w:val="ListBullet"/>
-        <w:spacing w:before="20" w:after="20" w:line="252" w:lineRule="auto"/>
+        <w:spacing w:before="10" w:after="10" w:line="252" w:lineRule="auto"/>
       </w:pPr>
       <w:r>
         <w:t>Maintained 100% data integrity and accuracy in compliance-critical records for International Student Services with zero audit discrepancies.</w:t>
@@ -571,8 +535,8 @@
         <w:tblLook w:firstColumn="1" w:firstRow="1" w:lastColumn="0" w:lastRow="0" w:noHBand="0" w:noVBand="1" w:val="04A0"/>
       </w:tblPr>
       <w:tblGrid>
-        <w:gridCol w:w="7200"/>
-        <w:gridCol w:w="3600"/>
+        <w:gridCol w:w="7488"/>
+        <w:gridCol w:w="3312"/>
       </w:tblGrid>
       <w:tr>
         <w:tc>
@@ -587,12 +551,12 @@
           </w:tcPr>
           <w:p>
             <w:pPr>
-              <w:spacing w:before="40" w:after="20"/>
+              <w:spacing w:before="40" w:after="0"/>
             </w:pPr>
             <w:r>
               <w:rPr>
                 <w:b/>
-                <w:sz w:val="20"/>
+                <w:sz w:val="19"/>
               </w:rPr>
               <w:t>Google (via Randstad)</w:t>
             </w:r>
@@ -602,7 +566,7 @@
             <w:r>
               <w:rPr>
                 <w:i/>
-                <w:sz w:val="19"/>
+                <w:sz w:val="18"/>
               </w:rPr>
               <w:t>Talent Delivery Manager &amp; POD Lead</w:t>
             </w:r>
@@ -620,13 +584,13 @@
           </w:tcPr>
           <w:p>
             <w:pPr>
-              <w:spacing w:before="40" w:after="20"/>
+              <w:spacing w:before="40" w:after="0"/>
               <w:jc w:val="right"/>
             </w:pPr>
             <w:r>
               <w:rPr>
                 <w:b/>
-                <w:sz w:val="20"/>
+                <w:sz w:val="19"/>
               </w:rPr>
               <w:t>Aug 2021 – Dec 2023</w:t>
             </w:r>
@@ -635,7 +599,7 @@
             </w:r>
             <w:r>
               <w:rPr>
-                <w:sz w:val="19"/>
+                <w:sz w:val="18"/>
               </w:rPr>
               <w:t>Hyderabad, India</w:t>
             </w:r>
@@ -646,7 +610,7 @@
     <w:p>
       <w:pPr>
         <w:pStyle w:val="ListBullet"/>
-        <w:spacing w:before="20" w:after="20" w:line="252" w:lineRule="auto"/>
+        <w:spacing w:before="10" w:after="10" w:line="252" w:lineRule="auto"/>
       </w:pPr>
       <w:r>
         <w:t>Achieved 100% of quarterly performance targets across a 40-member screener team by managing daily workflows, delegating tasks, and forecasting capacity.</w:t>
@@ -655,7 +619,7 @@
     <w:p>
       <w:pPr>
         <w:pStyle w:val="ListBullet"/>
-        <w:spacing w:before="20" w:after="20" w:line="252" w:lineRule="auto"/>
+        <w:spacing w:before="10" w:after="10" w:line="252" w:lineRule="auto"/>
       </w:pPr>
       <w:r>
         <w:t>Fostered associate ownership as Subject Matter Expert (SME), directing training teams on coaching, onboarding, and continuous mentorship.</w:t>
@@ -664,7 +628,7 @@
     <w:p>
       <w:pPr>
         <w:pStyle w:val="ListBullet"/>
-        <w:spacing w:before="20" w:after="20" w:line="252" w:lineRule="auto"/>
+        <w:spacing w:before="10" w:after="10" w:line="252" w:lineRule="auto"/>
       </w:pPr>
       <w:r>
         <w:t>Sustained a 99–100% quality score across high-volume queues by enforcing SOPs and serving as the team's central QA control point.</w:t>
@@ -673,7 +637,7 @@
     <w:p>
       <w:pPr>
         <w:pStyle w:val="ListBullet"/>
-        <w:spacing w:before="20" w:after="20" w:line="252" w:lineRule="auto"/>
+        <w:spacing w:before="10" w:after="10" w:line="252" w:lineRule="auto"/>
       </w:pPr>
       <w:r>
         <w:t>Improved operational efficiency and reduced error recurrence through weekly RCA governance and prioritized solutions for policy gaps.</w:t>
@@ -686,8 +650,8 @@
         <w:tblLook w:firstColumn="1" w:firstRow="1" w:lastColumn="0" w:lastRow="0" w:noHBand="0" w:noVBand="1" w:val="04A0"/>
       </w:tblPr>
       <w:tblGrid>
-        <w:gridCol w:w="7200"/>
-        <w:gridCol w:w="3600"/>
+        <w:gridCol w:w="7488"/>
+        <w:gridCol w:w="3312"/>
       </w:tblGrid>
       <w:tr>
         <w:tc>
@@ -702,12 +666,12 @@
           </w:tcPr>
           <w:p>
             <w:pPr>
-              <w:spacing w:before="40" w:after="20"/>
+              <w:spacing w:before="40" w:after="0"/>
             </w:pPr>
             <w:r>
               <w:rPr>
                 <w:b/>
-                <w:sz w:val="20"/>
+                <w:sz w:val="19"/>
               </w:rPr>
               <w:t>Copart India</w:t>
             </w:r>
@@ -717,7 +681,7 @@
             <w:r>
               <w:rPr>
                 <w:i/>
-                <w:sz w:val="19"/>
+                <w:sz w:val="18"/>
               </w:rPr>
               <w:t>Business Process Executive</w:t>
             </w:r>
@@ -735,13 +699,13 @@
           </w:tcPr>
           <w:p>
             <w:pPr>
-              <w:spacing w:before="40" w:after="20"/>
+              <w:spacing w:before="40" w:after="0"/>
               <w:jc w:val="right"/>
             </w:pPr>
             <w:r>
               <w:rPr>
                 <w:b/>
-                <w:sz w:val="20"/>
+                <w:sz w:val="19"/>
               </w:rPr>
               <w:t>Dec 2020 – Aug 2021</w:t>
             </w:r>
@@ -750,7 +714,7 @@
             </w:r>
             <w:r>
               <w:rPr>
-                <w:sz w:val="19"/>
+                <w:sz w:val="18"/>
               </w:rPr>
               <w:t>Hyderabad, India</w:t>
             </w:r>
@@ -761,7 +725,7 @@
     <w:p>
       <w:pPr>
         <w:pStyle w:val="ListBullet"/>
-        <w:spacing w:before="20" w:after="20" w:line="252" w:lineRule="auto"/>
+        <w:spacing w:before="10" w:after="10" w:line="252" w:lineRule="auto"/>
       </w:pPr>
       <w:r>
         <w:t>Closed inbound commercial car-purchase negotiations end-to-end, managing vehicle valuation, B2B pricing, and pickup dispatch scheduling.</w:t>
@@ -770,7 +734,7 @@
     <w:p>
       <w:pPr>
         <w:pStyle w:val="ListBullet"/>
-        <w:spacing w:before="20" w:after="20" w:line="252" w:lineRule="auto"/>
+        <w:spacing w:before="10" w:after="10" w:line="252" w:lineRule="auto"/>
       </w:pPr>
       <w:r>
         <w:t>Resolved critical customer escalations and multi-tier follow-ups by logging and managing high-priority cases in Salesforce Service Cloud.</w:t>
@@ -783,8 +747,8 @@
         <w:tblLook w:firstColumn="1" w:firstRow="1" w:lastColumn="0" w:lastRow="0" w:noHBand="0" w:noVBand="1" w:val="04A0"/>
       </w:tblPr>
       <w:tblGrid>
-        <w:gridCol w:w="7200"/>
-        <w:gridCol w:w="3600"/>
+        <w:gridCol w:w="7488"/>
+        <w:gridCol w:w="3312"/>
       </w:tblGrid>
       <w:tr>
         <w:tc>
@@ -799,12 +763,12 @@
           </w:tcPr>
           <w:p>
             <w:pPr>
-              <w:spacing w:before="40" w:after="20"/>
+              <w:spacing w:before="40" w:after="0"/>
             </w:pPr>
             <w:r>
               <w:rPr>
                 <w:b/>
-                <w:sz w:val="20"/>
+                <w:sz w:val="19"/>
               </w:rPr>
               <w:t>Amazon</w:t>
             </w:r>
@@ -814,7 +778,7 @@
             <w:r>
               <w:rPr>
                 <w:i/>
-                <w:sz w:val="19"/>
+                <w:sz w:val="18"/>
               </w:rPr>
               <w:t>Transaction Risk Investigator</w:t>
             </w:r>
@@ -832,13 +796,13 @@
           </w:tcPr>
           <w:p>
             <w:pPr>
-              <w:spacing w:before="40" w:after="20"/>
+              <w:spacing w:before="40" w:after="0"/>
               <w:jc w:val="right"/>
             </w:pPr>
             <w:r>
               <w:rPr>
                 <w:b/>
-                <w:sz w:val="20"/>
+                <w:sz w:val="19"/>
               </w:rPr>
               <w:t>Jun 2020 – Dec 2020</w:t>
             </w:r>
@@ -847,7 +811,7 @@
             </w:r>
             <w:r>
               <w:rPr>
-                <w:sz w:val="19"/>
+                <w:sz w:val="18"/>
               </w:rPr>
               <w:t>Hyderabad, India</w:t>
             </w:r>
@@ -858,7 +822,7 @@
     <w:p>
       <w:pPr>
         <w:pStyle w:val="ListBullet"/>
-        <w:spacing w:before="20" w:after="20" w:line="252" w:lineRule="auto"/>
+        <w:spacing w:before="10" w:after="10" w:line="252" w:lineRule="auto"/>
       </w:pPr>
       <w:r>
         <w:t>Informed risk-mitigation strategies by analyzing high-volume merchant accounts for fraud patterns, transactional anomalies, and compliance gaps.</w:t>
@@ -867,7 +831,7 @@
     <w:p>
       <w:pPr>
         <w:pStyle w:val="ListBullet"/>
-        <w:spacing w:before="20" w:after="20" w:line="252" w:lineRule="auto"/>
+        <w:spacing w:before="10" w:after="10" w:line="252" w:lineRule="auto"/>
       </w:pPr>
       <w:r>
         <w:t>Ensured operational and data-protection policy adherence via detailed RCA on risk incidents, producing audit-ready documentation.</w:t>
@@ -880,8 +844,8 @@
         <w:tblLook w:firstColumn="1" w:firstRow="1" w:lastColumn="0" w:lastRow="0" w:noHBand="0" w:noVBand="1" w:val="04A0"/>
       </w:tblPr>
       <w:tblGrid>
-        <w:gridCol w:w="7200"/>
-        <w:gridCol w:w="3600"/>
+        <w:gridCol w:w="7488"/>
+        <w:gridCol w:w="3312"/>
       </w:tblGrid>
       <w:tr>
         <w:tc>
@@ -896,12 +860,12 @@
           </w:tcPr>
           <w:p>
             <w:pPr>
-              <w:spacing w:before="40" w:after="20"/>
+              <w:spacing w:before="40" w:after="0"/>
             </w:pPr>
             <w:r>
               <w:rPr>
                 <w:b/>
-                <w:sz w:val="20"/>
+                <w:sz w:val="19"/>
               </w:rPr>
               <w:t>Knoah Solutions</w:t>
             </w:r>
@@ -911,7 +875,7 @@
             <w:r>
               <w:rPr>
                 <w:i/>
-                <w:sz w:val="19"/>
+                <w:sz w:val="18"/>
               </w:rPr>
               <w:t>Quality Analyst &amp; Project Support Executive</w:t>
             </w:r>
@@ -929,13 +893,13 @@
           </w:tcPr>
           <w:p>
             <w:pPr>
-              <w:spacing w:before="40" w:after="20"/>
+              <w:spacing w:before="40" w:after="0"/>
               <w:jc w:val="right"/>
             </w:pPr>
             <w:r>
               <w:rPr>
                 <w:b/>
-                <w:sz w:val="20"/>
+                <w:sz w:val="19"/>
               </w:rPr>
               <w:t>Jul 2018 – Jun 2020</w:t>
             </w:r>
@@ -944,7 +908,7 @@
             </w:r>
             <w:r>
               <w:rPr>
-                <w:sz w:val="19"/>
+                <w:sz w:val="18"/>
               </w:rPr>
               <w:t>Hyderabad, India</w:t>
             </w:r>
@@ -955,7 +919,7 @@
     <w:p>
       <w:pPr>
         <w:pStyle w:val="ListBullet"/>
-        <w:spacing w:before="20" w:after="20" w:line="252" w:lineRule="auto"/>
+        <w:spacing w:before="10" w:after="10" w:line="252" w:lineRule="auto"/>
       </w:pPr>
       <w:r>
         <w:t>Resolved high-volume multichannel customer queries with 100% accuracy via Salesforce Service Cloud ticketing workflows.</w:t>
@@ -964,7 +928,7 @@
     <w:p>
       <w:pPr>
         <w:pStyle w:val="ListBullet"/>
-        <w:spacing w:before="20" w:after="20" w:line="252" w:lineRule="auto"/>
+        <w:spacing w:before="10" w:after="10" w:line="252" w:lineRule="auto"/>
       </w:pPr>
       <w:r>
         <w:t>Drove measurable performance improvement across a 30-person team via structured evaluations, QA guidelines, and frequent RCA audits.</w:t>
@@ -973,7 +937,7 @@
     <w:p>
       <w:pPr>
         <w:pStyle w:val="ListBullet"/>
-        <w:spacing w:before="20" w:after="20" w:line="252" w:lineRule="auto"/>
+        <w:spacing w:before="10" w:after="10" w:line="252" w:lineRule="auto"/>
       </w:pPr>
       <w:r>
         <w:t>Improved compliance and operational consistency by coaching 25 associates as SME on new service line rollouts.</w:t>
@@ -982,7 +946,7 @@
     <w:p>
       <w:pPr>
         <w:pStyle w:val="ListBullet"/>
-        <w:spacing w:before="20" w:after="20" w:line="252" w:lineRule="auto"/>
+        <w:spacing w:before="10" w:after="10" w:line="252" w:lineRule="auto"/>
       </w:pPr>
       <w:r>
         <w:t>Supported audit readiness by maintaining the central knowledge base and preparing weekly QA and executive audit reports.</w:t>
@@ -991,7 +955,7 @@
     <w:p>
       <w:pPr>
         <w:keepNext/>
-        <w:spacing w:before="120" w:after="40"/>
+        <w:spacing w:before="100" w:after="40"/>
         <w:pBdr>
           <w:bottom w:val="single" w:sz="12" w:space="1" w:color="000000"/>
         </w:pBdr>
@@ -1000,15 +964,15 @@
         <w:rPr>
           <w:b/>
           <w:color w:val="000000"/>
-          <w:sz w:val="22"/>
+          <w:sz w:val="21"/>
         </w:rPr>
-        <w:t>KEY ACHIEVEMENTS &amp; AWARDS</w:t>
+        <w:t>KEY ACHIEVEMENTS &amp; RECOGNITIONS</w:t>
       </w:r>
     </w:p>
     <w:p>
       <w:pPr>
         <w:pStyle w:val="ListBullet"/>
-        <w:spacing w:before="20" w:after="20" w:line="252" w:lineRule="auto"/>
+        <w:spacing w:before="10" w:after="10" w:line="252" w:lineRule="auto"/>
       </w:pPr>
       <w:r>
         <w:rPr>
@@ -1023,7 +987,7 @@
     <w:p>
       <w:pPr>
         <w:pStyle w:val="ListBullet"/>
-        <w:spacing w:before="20" w:after="20" w:line="252" w:lineRule="auto"/>
+        <w:spacing w:before="10" w:after="10" w:line="252" w:lineRule="auto"/>
       </w:pPr>
       <w:r>
         <w:rPr>
@@ -1038,7 +1002,7 @@
     <w:p>
       <w:pPr>
         <w:pStyle w:val="ListBullet"/>
-        <w:spacing w:before="20" w:after="20" w:line="252" w:lineRule="auto"/>
+        <w:spacing w:before="10" w:after="10" w:line="252" w:lineRule="auto"/>
       </w:pPr>
       <w:r>
         <w:rPr>
@@ -1053,7 +1017,7 @@
     <w:p>
       <w:pPr>
         <w:pStyle w:val="ListBullet"/>
-        <w:spacing w:before="20" w:after="20" w:line="252" w:lineRule="auto"/>
+        <w:spacing w:before="10" w:after="10" w:line="252" w:lineRule="auto"/>
       </w:pPr>
       <w:r>
         <w:rPr>
@@ -1068,7 +1032,7 @@
     <w:p>
       <w:pPr>
         <w:pStyle w:val="ListBullet"/>
-        <w:spacing w:before="20" w:after="20" w:line="252" w:lineRule="auto"/>
+        <w:spacing w:before="10" w:after="10" w:line="252" w:lineRule="auto"/>
       </w:pPr>
       <w:r>
         <w:rPr>
@@ -1082,7 +1046,7 @@
     </w:p>
     <w:sectPr>
       <w:pgSz w:w="12240" w:h="15840"/>
-      <w:pgMar w:top="720" w:right="720" w:bottom="720" w:left="720" w:header="720" w:footer="720" w:gutter="0"/>
+      <w:pgMar w:top="576" w:right="720" w:bottom="576" w:left="720" w:header="720" w:footer="720" w:gutter="0"/>
       <w:cols w:space="720"/>
       <w:docGrid w:linePitch="360"/>
     </w:sectPr>
@@ -1456,7 +1420,7 @@
     <w:rPr>
       <w:rFonts w:ascii="Calibri" w:hAnsi="Calibri"/>
       <w:color w:val="000000"/>
-      <w:sz w:val="20"/>
+      <w:sz w:val="19"/>
     </w:rPr>
   </w:style>
   <w:style w:type="paragraph" w:styleId="Header">

</xml_diff>